<commit_message>
Ajustes finais do código-fonte para langchaing e LLM gratuito
</commit_message>
<xml_diff>
--- a/templates/programa_auditoria_template.docx
+++ b/templates/programa_auditoria_template.docx
@@ -8,66 +8,6 @@
           <w:rFonts w:ascii="Arial" w:hAnsi="Arial" w:cs="Arial"/>
         </w:rPr>
       </w:pPr>
-      <w:r>
-        <w:rPr>
-          <w:noProof/>
-        </w:rPr>
-        <w:drawing>
-          <wp:anchor distT="0" distB="0" distL="114300" distR="114300" simplePos="0" relativeHeight="251658241" behindDoc="0" locked="0" layoutInCell="1" allowOverlap="1" wp14:anchorId="42168326" wp14:editId="7534B6FE">
-            <wp:simplePos x="0" y="0"/>
-            <wp:positionH relativeFrom="margin">
-              <wp:posOffset>-758190</wp:posOffset>
-            </wp:positionH>
-            <wp:positionV relativeFrom="margin">
-              <wp:posOffset>-720090</wp:posOffset>
-            </wp:positionV>
-            <wp:extent cx="7658100" cy="10696798"/>
-            <wp:effectExtent l="0" t="0" r="0" b="9525"/>
-            <wp:wrapNone/>
-            <wp:docPr id="4" name="Imagem 4" descr="Uma imagem contendo Logotipo&#10;&#10;Descrição gerada automaticamente"/>
-            <wp:cNvGraphicFramePr>
-              <a:graphicFrameLocks xmlns:a="http://schemas.openxmlformats.org/drawingml/2006/main" noChangeAspect="1"/>
-            </wp:cNvGraphicFramePr>
-            <a:graphic xmlns:a="http://schemas.openxmlformats.org/drawingml/2006/main">
-              <a:graphicData uri="http://schemas.openxmlformats.org/drawingml/2006/picture">
-                <pic:pic xmlns:pic="http://schemas.openxmlformats.org/drawingml/2006/picture">
-                  <pic:nvPicPr>
-                    <pic:cNvPr id="3" name="Imagem 3" descr="Uma imagem contendo Logotipo&#10;&#10;Descrição gerada automaticamente"/>
-                    <pic:cNvPicPr/>
-                  </pic:nvPicPr>
-                  <pic:blipFill>
-                    <a:blip r:embed="rId11" cstate="print">
-                      <a:extLst>
-                        <a:ext uri="{28A0092B-C50C-407E-A947-70E740481C1C}">
-                          <a14:useLocalDpi xmlns:a14="http://schemas.microsoft.com/office/drawing/2010/main" val="0"/>
-                        </a:ext>
-                      </a:extLst>
-                    </a:blip>
-                    <a:stretch>
-                      <a:fillRect/>
-                    </a:stretch>
-                  </pic:blipFill>
-                  <pic:spPr>
-                    <a:xfrm>
-                      <a:off x="0" y="0"/>
-                      <a:ext cx="7659228" cy="10698373"/>
-                    </a:xfrm>
-                    <a:prstGeom prst="rect">
-                      <a:avLst/>
-                    </a:prstGeom>
-                  </pic:spPr>
-                </pic:pic>
-              </a:graphicData>
-            </a:graphic>
-            <wp14:sizeRelH relativeFrom="page">
-              <wp14:pctWidth>0</wp14:pctWidth>
-            </wp14:sizeRelH>
-            <wp14:sizeRelV relativeFrom="page">
-              <wp14:pctHeight>0</wp14:pctHeight>
-            </wp14:sizeRelV>
-          </wp:anchor>
-        </w:drawing>
-      </w:r>
     </w:p>
     <w:p>
       <w:pPr>
@@ -75,12 +15,13 @@
           <w:rFonts w:ascii="Arial" w:hAnsi="Arial" w:cs="Arial"/>
         </w:rPr>
       </w:pPr>
-      <w:r>
+    </w:p>
+    <w:p>
+      <w:pPr>
         <w:rPr>
           <w:rFonts w:ascii="Arial" w:hAnsi="Arial" w:cs="Arial"/>
         </w:rPr>
-        <w:br w:type="page"/>
-      </w:r>
+      </w:pPr>
     </w:p>
     <w:p>
       <w:pPr>
@@ -88,67 +29,6 @@
           <w:rFonts w:ascii="Arial" w:hAnsi="Arial" w:cs="Arial"/>
         </w:rPr>
       </w:pPr>
-      <w:r>
-        <w:rPr>
-          <w:noProof/>
-        </w:rPr>
-        <w:lastRenderedPageBreak/>
-        <w:drawing>
-          <wp:anchor distT="0" distB="0" distL="114300" distR="114300" simplePos="0" relativeHeight="251658242" behindDoc="1" locked="0" layoutInCell="1" allowOverlap="1" wp14:anchorId="102ACCAB" wp14:editId="651F38F7">
-            <wp:simplePos x="0" y="0"/>
-            <wp:positionH relativeFrom="margin">
-              <wp:posOffset>-730250</wp:posOffset>
-            </wp:positionH>
-            <wp:positionV relativeFrom="margin">
-              <wp:posOffset>-726440</wp:posOffset>
-            </wp:positionV>
-            <wp:extent cx="7560000" cy="10697258"/>
-            <wp:effectExtent l="0" t="0" r="0" b="0"/>
-            <wp:wrapNone/>
-            <wp:docPr id="17" name="Imagem 17" descr="Diagrama&#10;&#10;Descrição gerada automaticamente"/>
-            <wp:cNvGraphicFramePr>
-              <a:graphicFrameLocks xmlns:a="http://schemas.openxmlformats.org/drawingml/2006/main" noChangeAspect="1"/>
-            </wp:cNvGraphicFramePr>
-            <a:graphic xmlns:a="http://schemas.openxmlformats.org/drawingml/2006/main">
-              <a:graphicData uri="http://schemas.openxmlformats.org/drawingml/2006/picture">
-                <pic:pic xmlns:pic="http://schemas.openxmlformats.org/drawingml/2006/picture">
-                  <pic:nvPicPr>
-                    <pic:cNvPr id="4" name="Imagem 4" descr="Diagrama&#10;&#10;Descrição gerada automaticamente"/>
-                    <pic:cNvPicPr/>
-                  </pic:nvPicPr>
-                  <pic:blipFill>
-                    <a:blip r:embed="rId12" cstate="print">
-                      <a:extLst>
-                        <a:ext uri="{28A0092B-C50C-407E-A947-70E740481C1C}">
-                          <a14:useLocalDpi xmlns:a14="http://schemas.microsoft.com/office/drawing/2010/main" val="0"/>
-                        </a:ext>
-                      </a:extLst>
-                    </a:blip>
-                    <a:stretch>
-                      <a:fillRect/>
-                    </a:stretch>
-                  </pic:blipFill>
-                  <pic:spPr>
-                    <a:xfrm>
-                      <a:off x="0" y="0"/>
-                      <a:ext cx="7560000" cy="10697258"/>
-                    </a:xfrm>
-                    <a:prstGeom prst="rect">
-                      <a:avLst/>
-                    </a:prstGeom>
-                  </pic:spPr>
-                </pic:pic>
-              </a:graphicData>
-            </a:graphic>
-            <wp14:sizeRelH relativeFrom="page">
-              <wp14:pctWidth>0</wp14:pctWidth>
-            </wp14:sizeRelH>
-            <wp14:sizeRelV relativeFrom="page">
-              <wp14:pctHeight>0</wp14:pctHeight>
-            </wp14:sizeRelV>
-          </wp:anchor>
-        </w:drawing>
-      </w:r>
     </w:p>
     <w:p>
       <w:pPr>
@@ -156,127 +36,233 @@
           <w:rFonts w:ascii="Arial" w:hAnsi="Arial" w:cs="Arial"/>
         </w:rPr>
       </w:pPr>
-      <w:r>
+    </w:p>
+    <w:p>
+      <w:pPr>
         <w:rPr>
           <w:rFonts w:ascii="Arial" w:hAnsi="Arial" w:cs="Arial"/>
-          <w:noProof/>
-        </w:rPr>
-        <mc:AlternateContent>
-          <mc:Choice Requires="wps">
-            <w:drawing>
-              <wp:anchor distT="0" distB="0" distL="114300" distR="114300" simplePos="0" relativeHeight="251658240" behindDoc="0" locked="0" layoutInCell="1" allowOverlap="1" wp14:anchorId="40EA325A" wp14:editId="0BBD3B3A">
-                <wp:simplePos x="0" y="0"/>
-                <wp:positionH relativeFrom="margin">
-                  <wp:align>center</wp:align>
-                </wp:positionH>
-                <wp:positionV relativeFrom="paragraph">
-                  <wp:posOffset>630555</wp:posOffset>
-                </wp:positionV>
-                <wp:extent cx="6543675" cy="3486150"/>
-                <wp:effectExtent l="0" t="0" r="0" b="0"/>
-                <wp:wrapNone/>
-                <wp:docPr id="7" name="Caixa de Texto 7"/>
-                <wp:cNvGraphicFramePr/>
-                <a:graphic xmlns:a="http://schemas.openxmlformats.org/drawingml/2006/main">
-                  <a:graphicData uri="http://schemas.microsoft.com/office/word/2010/wordprocessingShape">
-                    <wps:wsp>
-                      <wps:cNvSpPr txBox="1"/>
-                      <wps:spPr>
-                        <a:xfrm>
-                          <a:off x="0" y="0"/>
-                          <a:ext cx="6543675" cy="3486150"/>
-                        </a:xfrm>
-                        <a:prstGeom prst="rect">
-                          <a:avLst/>
-                        </a:prstGeom>
-                        <a:noFill/>
-                        <a:ln w="6350">
-                          <a:noFill/>
-                        </a:ln>
-                      </wps:spPr>
-                      <wps:txbx>
-                        <w:txbxContent>
-                          <w:p>
-                            <w:pPr>
-                              <w:jc w:val="center"/>
-                              <w:rPr>
-                                <w:b/>
-                                <w:bCs/>
-                                <w:color w:val="FFFFFF" w:themeColor="background1"/>
-                                <w:sz w:val="96"/>
-                                <w:szCs w:val="96"/>
-                              </w:rPr>
-                            </w:pPr>
-                            <w:r>
-                              <w:rPr>
-                                <w:b/>
-                                <w:bCs/>
-                                <w:color w:val="FFFFFF" w:themeColor="background1"/>
-                                <w:sz w:val="96"/>
-                                <w:szCs w:val="96"/>
-                              </w:rPr>
-                              <w:t>Programa de Auditoria</w:t>
-                            </w:r>
-                          </w:p>
-                        </w:txbxContent>
-                      </wps:txbx>
-                      <wps:bodyPr rot="0" spcFirstLastPara="0" vertOverflow="overflow" horzOverflow="overflow" vert="horz" wrap="square" lIns="91440" tIns="45720" rIns="91440" bIns="45720" numCol="1" spcCol="0" rtlCol="0" fromWordArt="0" anchor="t" anchorCtr="0" forceAA="0" compatLnSpc="1">
-                        <a:prstTxWarp prst="textNoShape">
-                          <a:avLst/>
-                        </a:prstTxWarp>
-                        <a:noAutofit/>
-                      </wps:bodyPr>
-                    </wps:wsp>
-                  </a:graphicData>
-                </a:graphic>
-                <wp14:sizeRelH relativeFrom="margin">
-                  <wp14:pctWidth>0</wp14:pctWidth>
-                </wp14:sizeRelH>
-                <wp14:sizeRelV relativeFrom="margin">
-                  <wp14:pctHeight>0</wp14:pctHeight>
-                </wp14:sizeRelV>
-              </wp:anchor>
-            </w:drawing>
-          </mc:Choice>
-          <mc:Fallback>
-            <w:pict>
-              <v:shapetype w14:anchorId="40EA325A" id="_x0000_t202" coordsize="21600,21600" o:spt="202" path="m,l,21600r21600,l21600,xe">
-                <v:stroke joinstyle="miter"/>
-                <v:path gradientshapeok="t" o:connecttype="rect"/>
-              </v:shapetype>
-              <v:shape id="Caixa de Texto 7" o:spid="_x0000_s1026" type="#_x0000_t202" style="position:absolute;margin-left:0;margin-top:49.65pt;width:515.25pt;height:274.5pt;z-index:251658240;visibility:visible;mso-wrap-style:square;mso-width-percent:0;mso-height-percent:0;mso-wrap-distance-left:9pt;mso-wrap-distance-top:0;mso-wrap-distance-right:9pt;mso-wrap-distance-bottom:0;mso-position-horizontal:center;mso-position-horizontal-relative:margin;mso-position-vertical:absolute;mso-position-vertical-relative:text;mso-width-percent:0;mso-height-percent:0;mso-width-relative:margin;mso-height-relative:margin;v-text-anchor:top" o:gfxdata="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" filled="f" stroked="f" strokeweight=".5pt">
-                <v:textbox>
-                  <w:txbxContent>
-                    <w:p>
-                      <w:pPr>
-                        <w:jc w:val="center"/>
-                        <w:rPr>
-                          <w:b/>
-                          <w:bCs/>
-                          <w:color w:val="FFFFFF" w:themeColor="background1"/>
-                          <w:sz w:val="96"/>
-                          <w:szCs w:val="96"/>
-                        </w:rPr>
-                      </w:pPr>
-                      <w:r>
-                        <w:rPr>
-                          <w:b/>
-                          <w:bCs/>
-                          <w:color w:val="FFFFFF" w:themeColor="background1"/>
-                          <w:sz w:val="96"/>
-                          <w:szCs w:val="96"/>
-                        </w:rPr>
-                        <w:t>Programa de Auditoria</w:t>
-                      </w:r>
-                    </w:p>
-                  </w:txbxContent>
-                </v:textbox>
-                <w10:wrap anchorx="margin"/>
-              </v:shape>
-            </w:pict>
-          </mc:Fallback>
-        </mc:AlternateContent>
-      </w:r>
+        </w:rPr>
+      </w:pPr>
+    </w:p>
+    <w:p>
+      <w:pPr>
+        <w:rPr>
+          <w:rFonts w:ascii="Arial" w:hAnsi="Arial" w:cs="Arial"/>
+        </w:rPr>
+      </w:pPr>
+    </w:p>
+    <w:p>
+      <w:pPr>
+        <w:rPr>
+          <w:rFonts w:ascii="Arial" w:hAnsi="Arial" w:cs="Arial"/>
+        </w:rPr>
+      </w:pPr>
+    </w:p>
+    <w:p>
+      <w:pPr>
+        <w:rPr>
+          <w:rFonts w:ascii="Arial" w:hAnsi="Arial" w:cs="Arial"/>
+        </w:rPr>
+      </w:pPr>
+    </w:p>
+    <w:p>
+      <w:pPr>
+        <w:rPr>
+          <w:rFonts w:ascii="Arial" w:hAnsi="Arial" w:cs="Arial"/>
+        </w:rPr>
+      </w:pPr>
+    </w:p>
+    <w:p>
+      <w:pPr>
+        <w:rPr>
+          <w:rFonts w:ascii="Arial" w:hAnsi="Arial" w:cs="Arial"/>
+        </w:rPr>
+      </w:pPr>
+    </w:p>
+    <w:p>
+      <w:pPr>
+        <w:rPr>
+          <w:rFonts w:ascii="Arial" w:hAnsi="Arial" w:cs="Arial"/>
+        </w:rPr>
+      </w:pPr>
+    </w:p>
+    <w:p>
+      <w:pPr>
+        <w:rPr>
+          <w:rFonts w:ascii="Arial" w:hAnsi="Arial" w:cs="Arial"/>
+        </w:rPr>
+      </w:pPr>
+    </w:p>
+    <w:p>
+      <w:pPr>
+        <w:jc w:val="center"/>
+        <w:rPr>
+          <w:rFonts w:ascii="Arial" w:hAnsi="Arial" w:cs="Arial"/>
+          <w:b/>
+          <w:bCs/>
+          <w:sz w:val="32"/>
+          <w:szCs w:val="32"/>
+        </w:rPr>
+      </w:pPr>
+    </w:p>
+    <w:p>
+      <w:pPr>
+        <w:jc w:val="center"/>
+        <w:rPr>
+          <w:rFonts w:ascii="Arial" w:hAnsi="Arial" w:cs="Arial"/>
+          <w:b/>
+          <w:bCs/>
+          <w:sz w:val="32"/>
+          <w:szCs w:val="32"/>
+        </w:rPr>
+      </w:pPr>
+    </w:p>
+    <w:p>
+      <w:pPr>
+        <w:jc w:val="center"/>
+        <w:rPr>
+          <w:rFonts w:ascii="Arial" w:hAnsi="Arial" w:cs="Arial"/>
+          <w:b/>
+          <w:bCs/>
+          <w:sz w:val="32"/>
+          <w:szCs w:val="32"/>
+        </w:rPr>
+      </w:pPr>
+    </w:p>
+    <w:p>
+      <w:pPr>
+        <w:jc w:val="center"/>
+        <w:rPr>
+          <w:rFonts w:ascii="Arial" w:hAnsi="Arial" w:cs="Arial"/>
+          <w:b/>
+          <w:bCs/>
+          <w:sz w:val="32"/>
+          <w:szCs w:val="32"/>
+        </w:rPr>
+      </w:pPr>
+    </w:p>
+    <w:p>
+      <w:pPr>
+        <w:jc w:val="center"/>
+        <w:rPr>
+          <w:rFonts w:ascii="Arial" w:hAnsi="Arial" w:cs="Arial"/>
+          <w:b/>
+          <w:bCs/>
+          <w:sz w:val="32"/>
+          <w:szCs w:val="32"/>
+        </w:rPr>
+      </w:pPr>
+    </w:p>
+    <w:p>
+      <w:pPr>
+        <w:jc w:val="center"/>
+        <w:rPr>
+          <w:rFonts w:ascii="Arial" w:hAnsi="Arial" w:cs="Arial"/>
+          <w:b/>
+          <w:bCs/>
+          <w:sz w:val="32"/>
+          <w:szCs w:val="32"/>
+        </w:rPr>
+      </w:pPr>
+      <w:r>
+        <w:rPr>
+          <w:rFonts w:ascii="Arial" w:hAnsi="Arial" w:cs="Arial"/>
+          <w:b/>
+          <w:bCs/>
+          <w:sz w:val="32"/>
+          <w:szCs w:val="32"/>
+        </w:rPr>
+        <w:t xml:space="preserve">IDENTIDADE VISUAL DO ÓRGÃO </w:t>
+      </w:r>
+    </w:p>
+    <w:p>
+      <w:pPr>
+        <w:jc w:val="center"/>
+        <w:rPr>
+          <w:rFonts w:ascii="Arial" w:hAnsi="Arial" w:cs="Arial"/>
+          <w:b/>
+          <w:bCs/>
+          <w:sz w:val="32"/>
+          <w:szCs w:val="32"/>
+        </w:rPr>
+      </w:pPr>
+      <w:r>
+        <w:rPr>
+          <w:rFonts w:ascii="Arial" w:hAnsi="Arial" w:cs="Arial"/>
+          <w:b/>
+          <w:bCs/>
+          <w:sz w:val="32"/>
+          <w:szCs w:val="32"/>
+        </w:rPr>
+        <w:t>(CAPA)</w:t>
+      </w:r>
+    </w:p>
+    <w:p>
+      <w:pPr>
+        <w:jc w:val="center"/>
+        <w:rPr>
+          <w:rFonts w:ascii="Arial" w:hAnsi="Arial" w:cs="Arial"/>
+          <w:i/>
+          <w:iCs/>
+          <w:sz w:val="20"/>
+          <w:szCs w:val="20"/>
+        </w:rPr>
+      </w:pPr>
+      <w:r>
+        <w:rPr>
+          <w:rFonts w:ascii="Arial" w:hAnsi="Arial" w:cs="Arial"/>
+          <w:i/>
+          <w:iCs/>
+          <w:sz w:val="20"/>
+          <w:szCs w:val="20"/>
+        </w:rPr>
+        <w:t>Excluída a identidade visual do TJDFT por motivos de segurança</w:t>
+      </w:r>
+    </w:p>
+    <w:p>
+      <w:pPr>
+        <w:jc w:val="center"/>
+        <w:rPr>
+          <w:rFonts w:ascii="Arial" w:hAnsi="Arial" w:cs="Arial"/>
+          <w:sz w:val="28"/>
+          <w:szCs w:val="28"/>
+        </w:rPr>
+      </w:pPr>
+    </w:p>
+    <w:p>
+      <w:pPr>
+        <w:rPr>
+          <w:rFonts w:ascii="Arial" w:hAnsi="Arial" w:cs="Arial"/>
+        </w:rPr>
+      </w:pPr>
+    </w:p>
+    <w:p>
+      <w:pPr>
+        <w:rPr>
+          <w:rFonts w:ascii="Arial" w:hAnsi="Arial" w:cs="Arial"/>
+        </w:rPr>
+      </w:pPr>
+    </w:p>
+    <w:p>
+      <w:pPr>
+        <w:rPr>
+          <w:rFonts w:ascii="Arial" w:hAnsi="Arial" w:cs="Arial"/>
+        </w:rPr>
+      </w:pPr>
+    </w:p>
+    <w:p>
+      <w:pPr>
+        <w:rPr>
+          <w:rFonts w:ascii="Arial" w:hAnsi="Arial" w:cs="Arial"/>
+        </w:rPr>
+      </w:pPr>
+    </w:p>
+    <w:p>
+      <w:pPr>
+        <w:rPr>
+          <w:rFonts w:ascii="Arial" w:hAnsi="Arial" w:cs="Arial"/>
+        </w:rPr>
+      </w:pPr>
       <w:r>
         <w:rPr>
           <w:rFonts w:ascii="Arial" w:hAnsi="Arial" w:cs="Arial"/>
@@ -340,7 +326,7 @@
           <w:sz w:val="52"/>
           <w:szCs w:val="52"/>
         </w:rPr>
-        <w:t>titulo_</w:t>
+        <w:t>objeto</w:t>
       </w:r>
       <w:r>
         <w:rPr>
@@ -351,7 +337,7 @@
           <w:sz w:val="52"/>
           <w:szCs w:val="52"/>
         </w:rPr>
-        <w:t>auditoria}}</w:t>
+        <w:t>}}</w:t>
       </w:r>
     </w:p>
     <w:p>
@@ -495,35 +481,97 @@
           <w:rFonts w:ascii="Arial" w:hAnsi="Arial" w:cs="Arial"/>
           <w:color w:val="000000"/>
         </w:rPr>
-        <w:t>{{ano_atual}}</w:t>
-      </w:r>
+        <w:t>{{</w:t>
+      </w:r>
+      <w:proofErr w:type="spellStart"/>
       <w:r>
         <w:rPr>
           <w:rFonts w:ascii="Arial" w:hAnsi="Arial" w:cs="Arial"/>
           <w:color w:val="000000"/>
         </w:rPr>
-        <w:t xml:space="preserve">, Anexo I, Parte I, PA SEI </w:t>
-      </w:r>
+        <w:t>ano_atual</w:t>
+      </w:r>
+      <w:proofErr w:type="spellEnd"/>
       <w:r>
         <w:rPr>
           <w:rFonts w:ascii="Arial" w:hAnsi="Arial" w:cs="Arial"/>
           <w:color w:val="000000"/>
         </w:rPr>
-        <w:t>{{PA_SEI_Autorizacao}}; {{PA_SEI_Auditoria}} - Audito</w:t>
+        <w:t>}}</w:t>
       </w:r>
       <w:r>
         <w:rPr>
           <w:rFonts w:ascii="Arial" w:hAnsi="Arial" w:cs="Arial"/>
           <w:color w:val="000000"/>
         </w:rPr>
-        <w:t xml:space="preserve">ria </w:t>
+        <w:t xml:space="preserve">, Anexo I, Parte I, PA SEI </w:t>
       </w:r>
       <w:r>
         <w:rPr>
           <w:rFonts w:ascii="Arial" w:hAnsi="Arial" w:cs="Arial"/>
           <w:color w:val="000000"/>
         </w:rPr>
-        <w:t>{{titulo_auditoria}}</w:t>
+        <w:t>{{</w:t>
+      </w:r>
+      <w:proofErr w:type="spellStart"/>
+      <w:r>
+        <w:rPr>
+          <w:rFonts w:ascii="Arial" w:hAnsi="Arial" w:cs="Arial"/>
+          <w:color w:val="000000"/>
+        </w:rPr>
+        <w:t>PA_SEI_Autorizacao</w:t>
+      </w:r>
+      <w:proofErr w:type="spellEnd"/>
+      <w:r>
+        <w:rPr>
+          <w:rFonts w:ascii="Arial" w:hAnsi="Arial" w:cs="Arial"/>
+          <w:color w:val="000000"/>
+        </w:rPr>
+        <w:t>}}; {{</w:t>
+      </w:r>
+      <w:proofErr w:type="spellStart"/>
+      <w:r>
+        <w:rPr>
+          <w:rFonts w:ascii="Arial" w:hAnsi="Arial" w:cs="Arial"/>
+          <w:color w:val="000000"/>
+        </w:rPr>
+        <w:t>PA_SEI_Auditoria</w:t>
+      </w:r>
+      <w:proofErr w:type="spellEnd"/>
+      <w:r>
+        <w:rPr>
+          <w:rFonts w:ascii="Arial" w:hAnsi="Arial" w:cs="Arial"/>
+          <w:color w:val="000000"/>
+        </w:rPr>
+        <w:t>}} - Audito</w:t>
+      </w:r>
+      <w:r>
+        <w:rPr>
+          <w:rFonts w:ascii="Arial" w:hAnsi="Arial" w:cs="Arial"/>
+          <w:color w:val="000000"/>
+        </w:rPr>
+        <w:t xml:space="preserve">ria </w:t>
+      </w:r>
+      <w:r>
+        <w:rPr>
+          <w:rFonts w:ascii="Arial" w:hAnsi="Arial" w:cs="Arial"/>
+          <w:color w:val="000000"/>
+        </w:rPr>
+        <w:t>{{</w:t>
+      </w:r>
+      <w:r>
+        <w:rPr>
+          <w:rFonts w:ascii="Arial" w:hAnsi="Arial" w:cs="Arial"/>
+          <w:color w:val="000000"/>
+        </w:rPr>
+        <w:t>objeto</w:t>
+      </w:r>
+      <w:r>
+        <w:rPr>
+          <w:rFonts w:ascii="Arial" w:hAnsi="Arial" w:cs="Arial"/>
+          <w:color w:val="000000"/>
+        </w:rPr>
+        <w:t>}}</w:t>
       </w:r>
       <w:r>
         <w:rPr>
@@ -586,22 +634,40 @@
           <w:rFonts w:ascii="Arial" w:hAnsi="Arial" w:cs="Arial"/>
           <w:color w:val="000000"/>
         </w:rPr>
-        <w:t>{{PA_SEI_Autorizacao}}</w:t>
-      </w:r>
+        <w:t>{{</w:t>
+      </w:r>
+      <w:proofErr w:type="spellStart"/>
       <w:r>
         <w:rPr>
           <w:rFonts w:ascii="Arial" w:hAnsi="Arial" w:cs="Arial"/>
           <w:color w:val="000000"/>
         </w:rPr>
-        <w:t xml:space="preserve"> (Despacho GPR </w:t>
-      </w:r>
+        <w:t>PA_SEI_Autorizacao</w:t>
+      </w:r>
+      <w:proofErr w:type="spellEnd"/>
       <w:r>
         <w:rPr>
           <w:rFonts w:ascii="Arial" w:hAnsi="Arial" w:cs="Arial"/>
           <w:color w:val="000000"/>
         </w:rPr>
+        <w:t>}}</w:t>
+      </w:r>
+      <w:r>
+        <w:rPr>
+          <w:rFonts w:ascii="Arial" w:hAnsi="Arial" w:cs="Arial"/>
+          <w:color w:val="000000"/>
+        </w:rPr>
+        <w:t xml:space="preserve"> (Despacho GPR </w:t>
+      </w:r>
+      <w:proofErr w:type="spellStart"/>
+      <w:r>
+        <w:rPr>
+          <w:rFonts w:ascii="Arial" w:hAnsi="Arial" w:cs="Arial"/>
+          <w:color w:val="000000"/>
+        </w:rPr>
         <w:t>xxxx</w:t>
       </w:r>
+      <w:proofErr w:type="spellEnd"/>
       <w:r>
         <w:rPr>
           <w:rFonts w:ascii="Arial" w:hAnsi="Arial" w:cs="Arial"/>
@@ -727,7 +793,23 @@
           <w:rFonts w:ascii="Arial" w:eastAsia="Times New Roman" w:hAnsi="Arial" w:cs="Arial"/>
           <w:color w:val="000000"/>
         </w:rPr>
-        <w:t>{{periodo}}</w:t>
+        <w:t>{{</w:t>
+      </w:r>
+      <w:proofErr w:type="spellStart"/>
+      <w:r>
+        <w:rPr>
+          <w:rFonts w:ascii="Arial" w:eastAsia="Times New Roman" w:hAnsi="Arial" w:cs="Arial"/>
+          <w:color w:val="000000"/>
+        </w:rPr>
+        <w:t>periodo</w:t>
+      </w:r>
+      <w:proofErr w:type="spellEnd"/>
+      <w:r>
+        <w:rPr>
+          <w:rFonts w:ascii="Arial" w:eastAsia="Times New Roman" w:hAnsi="Arial" w:cs="Arial"/>
+          <w:color w:val="000000"/>
+        </w:rPr>
+        <w:t>}}</w:t>
       </w:r>
       <w:r>
         <w:rPr>
@@ -896,7 +978,25 @@
           <w:bCs/>
           <w:color w:val="000000"/>
         </w:rPr>
-        <w:t>{{unidades_auditadas}}</w:t>
+        <w:t>{{</w:t>
+      </w:r>
+      <w:proofErr w:type="spellStart"/>
+      <w:r>
+        <w:rPr>
+          <w:rFonts w:ascii="Arial" w:eastAsia="Times New Roman" w:hAnsi="Arial" w:cs="Arial"/>
+          <w:bCs/>
+          <w:color w:val="000000"/>
+        </w:rPr>
+        <w:t>unidades_auditadas</w:t>
+      </w:r>
+      <w:proofErr w:type="spellEnd"/>
+      <w:r>
+        <w:rPr>
+          <w:rFonts w:ascii="Arial" w:eastAsia="Times New Roman" w:hAnsi="Arial" w:cs="Arial"/>
+          <w:bCs/>
+          <w:color w:val="000000"/>
+        </w:rPr>
+        <w:t>}}</w:t>
       </w:r>
     </w:p>
     <w:p>
@@ -1023,10 +1123,9 @@
           <w:bCs/>
         </w:rPr>
         <w:sectPr>
-          <w:headerReference w:type="even" r:id="rId13"/>
-          <w:headerReference w:type="default" r:id="rId14"/>
-          <w:footerReference w:type="default" r:id="rId15"/>
-          <w:headerReference w:type="first" r:id="rId16"/>
+          <w:headerReference w:type="even" r:id="rId11"/>
+          <w:footerReference w:type="default" r:id="rId12"/>
+          <w:headerReference w:type="first" r:id="rId13"/>
           <w:pgSz w:w="11906" w:h="16838"/>
           <w:pgMar w:top="1134" w:right="1134" w:bottom="1134" w:left="1134" w:header="709" w:footer="709" w:gutter="0"/>
           <w:cols w:space="708"/>
@@ -2969,27 +3068,59 @@
           <w:rFonts w:ascii="Arial" w:hAnsi="Arial" w:cs="Arial"/>
           <w:color w:val="000000" w:themeColor="text1"/>
         </w:rPr>
-        <w:t>{{periodo}}</w:t>
-      </w:r>
+        <w:t>{{</w:t>
+      </w:r>
+      <w:proofErr w:type="spellStart"/>
       <w:r>
         <w:rPr>
           <w:rFonts w:ascii="Arial" w:hAnsi="Arial" w:cs="Arial"/>
           <w:color w:val="000000" w:themeColor="text1"/>
         </w:rPr>
-        <w:t xml:space="preserve">, em atenção ao Plano Anual de Auditoria – PAA </w:t>
-      </w:r>
+        <w:t>periodo</w:t>
+      </w:r>
+      <w:proofErr w:type="spellEnd"/>
       <w:r>
         <w:rPr>
           <w:rFonts w:ascii="Arial" w:hAnsi="Arial" w:cs="Arial"/>
           <w:color w:val="000000" w:themeColor="text1"/>
         </w:rPr>
-        <w:t>{{ano_atual}}</w:t>
+        <w:t>}}</w:t>
       </w:r>
       <w:r>
         <w:rPr>
           <w:rFonts w:ascii="Arial" w:hAnsi="Arial" w:cs="Arial"/>
           <w:color w:val="000000" w:themeColor="text1"/>
         </w:rPr>
+        <w:t xml:space="preserve">, em atenção ao Plano Anual de Auditoria – PAA </w:t>
+      </w:r>
+      <w:r>
+        <w:rPr>
+          <w:rFonts w:ascii="Arial" w:hAnsi="Arial" w:cs="Arial"/>
+          <w:color w:val="000000" w:themeColor="text1"/>
+        </w:rPr>
+        <w:t>{{</w:t>
+      </w:r>
+      <w:proofErr w:type="spellStart"/>
+      <w:r>
+        <w:rPr>
+          <w:rFonts w:ascii="Arial" w:hAnsi="Arial" w:cs="Arial"/>
+          <w:color w:val="000000" w:themeColor="text1"/>
+        </w:rPr>
+        <w:t>ano_atual</w:t>
+      </w:r>
+      <w:proofErr w:type="spellEnd"/>
+      <w:r>
+        <w:rPr>
+          <w:rFonts w:ascii="Arial" w:hAnsi="Arial" w:cs="Arial"/>
+          <w:color w:val="000000" w:themeColor="text1"/>
+        </w:rPr>
+        <w:t>}}</w:t>
+      </w:r>
+      <w:r>
+        <w:rPr>
+          <w:rFonts w:ascii="Arial" w:hAnsi="Arial" w:cs="Arial"/>
+          <w:color w:val="000000" w:themeColor="text1"/>
+        </w:rPr>
         <w:t xml:space="preserve">, </w:t>
       </w:r>
       <w:r>
@@ -3004,7 +3135,39 @@
           <w:rFonts w:ascii="Arial" w:hAnsi="Arial" w:cs="Arial"/>
           <w:color w:val="000000"/>
         </w:rPr>
-        <w:t>{{PA_SEI_Autorizacao}} e {{PA_SEI_Auditoria}}.</w:t>
+        <w:t>{{</w:t>
+      </w:r>
+      <w:proofErr w:type="spellStart"/>
+      <w:r>
+        <w:rPr>
+          <w:rFonts w:ascii="Arial" w:hAnsi="Arial" w:cs="Arial"/>
+          <w:color w:val="000000"/>
+        </w:rPr>
+        <w:t>PA_SEI_Autorizacao</w:t>
+      </w:r>
+      <w:proofErr w:type="spellEnd"/>
+      <w:r>
+        <w:rPr>
+          <w:rFonts w:ascii="Arial" w:hAnsi="Arial" w:cs="Arial"/>
+          <w:color w:val="000000"/>
+        </w:rPr>
+        <w:t>}} e {{</w:t>
+      </w:r>
+      <w:proofErr w:type="spellStart"/>
+      <w:r>
+        <w:rPr>
+          <w:rFonts w:ascii="Arial" w:hAnsi="Arial" w:cs="Arial"/>
+          <w:color w:val="000000"/>
+        </w:rPr>
+        <w:t>PA_SEI_Auditoria</w:t>
+      </w:r>
+      <w:proofErr w:type="spellEnd"/>
+      <w:r>
+        <w:rPr>
+          <w:rFonts w:ascii="Arial" w:hAnsi="Arial" w:cs="Arial"/>
+          <w:color w:val="000000"/>
+        </w:rPr>
+        <w:t>}}.</w:t>
       </w:r>
     </w:p>
     <w:p>
@@ -3078,7 +3241,15 @@
         <w:ind w:firstLine="720"/>
       </w:pPr>
       <w:r>
-        <w:t>Os trabalhos de auditoria, serão conduzidos de acordo com as normas aplicáveis à auditoria interna governamental da Secretaria de Auditoria Interna – SEAI: Resoluções CNJ n°s 308 e 309, de 2020; Estatuto de Auditoria Interna do TJDFT</w:t>
+        <w:t xml:space="preserve">Os trabalhos de auditoria, serão conduzidos de acordo com as normas aplicáveis à auditoria interna governamental da Secretaria de Auditoria Interna – SEAI: Resoluções CNJ </w:t>
+      </w:r>
+      <w:proofErr w:type="spellStart"/>
+      <w:r>
+        <w:t>n°s</w:t>
+      </w:r>
+      <w:proofErr w:type="spellEnd"/>
+      <w:r>
+        <w:t xml:space="preserve"> 308 e 309, de 2020; Estatuto de Auditoria Interna do TJDFT</w:t>
       </w:r>
       <w:r>
         <w:rPr>
@@ -3312,7 +3483,21 @@
         <w:rPr>
           <w:color w:val="000000" w:themeColor="text1"/>
         </w:rPr>
-        <w:t>{{unidades_auditadas}}</w:t>
+        <w:t>{{</w:t>
+      </w:r>
+      <w:proofErr w:type="spellStart"/>
+      <w:r>
+        <w:rPr>
+          <w:color w:val="000000" w:themeColor="text1"/>
+        </w:rPr>
+        <w:t>unidades_auditadas</w:t>
+      </w:r>
+      <w:proofErr w:type="spellEnd"/>
+      <w:r>
+        <w:rPr>
+          <w:color w:val="000000" w:themeColor="text1"/>
+        </w:rPr>
+        <w:t>}}</w:t>
       </w:r>
     </w:p>
     <w:p>
@@ -3384,14 +3569,16 @@
         <w:ind w:firstLine="709"/>
       </w:pPr>
       <w:r>
-        <w:t>{{legislacao}}</w:t>
-      </w:r>
-    </w:p>
-    <w:p>
-      <w:pPr>
-        <w:pStyle w:val="NormalSECI"/>
-        <w:ind w:firstLine="709"/>
-      </w:pPr>
+        <w:t>{{</w:t>
+      </w:r>
+      <w:proofErr w:type="spellStart"/>
+      <w:r>
+        <w:t>legislacao</w:t>
+      </w:r>
+      <w:proofErr w:type="spellEnd"/>
+      <w:r>
+        <w:t>}}</w:t>
+      </w:r>
     </w:p>
     <w:p>
       <w:pPr>
@@ -3457,8 +3644,7 @@
         <w:ind w:firstLine="720"/>
         <w:jc w:val="both"/>
         <w:rPr>
-          <w:rFonts w:ascii="Arial" w:hAnsi="Arial" w:cs="Arial"/>
-          <w:color w:val="000000"/>
+          <w:rFonts w:ascii="Arial" w:eastAsia="Arial" w:hAnsi="Arial" w:cs="Arial"/>
         </w:rPr>
       </w:pPr>
       <w:r>
@@ -3481,9 +3667,8 @@
         <w:ind w:firstLine="720"/>
         <w:jc w:val="both"/>
         <w:rPr>
-          <w:rFonts w:ascii="Arial" w:eastAsia="Arial" w:hAnsi="Arial" w:cs="Arial"/>
-          <w:sz w:val="22"/>
-          <w:szCs w:val="22"/>
+          <w:rFonts w:ascii="Arial" w:hAnsi="Arial" w:cs="Arial"/>
+          <w:color w:val="000000"/>
         </w:rPr>
       </w:pPr>
     </w:p>
@@ -4104,21 +4289,37 @@
           <w:rFonts w:ascii="Arial" w:eastAsia="Arial" w:hAnsi="Arial" w:cs="Arial"/>
           <w:lang w:eastAsia="pt-BR"/>
         </w:rPr>
-        <w:t>{{quest</w:t>
-      </w:r>
+        <w:t>{{</w:t>
+      </w:r>
+      <w:proofErr w:type="spellStart"/>
       <w:r>
         <w:rPr>
           <w:rFonts w:ascii="Arial" w:eastAsia="Arial" w:hAnsi="Arial" w:cs="Arial"/>
           <w:lang w:eastAsia="pt-BR"/>
         </w:rPr>
-        <w:t>o</w:t>
+        <w:t>quest</w:t>
       </w:r>
       <w:r>
         <w:rPr>
           <w:rFonts w:ascii="Arial" w:eastAsia="Arial" w:hAnsi="Arial" w:cs="Arial"/>
           <w:lang w:eastAsia="pt-BR"/>
         </w:rPr>
-        <w:t>es_auditoria}}</w:t>
+        <w:t>o</w:t>
+      </w:r>
+      <w:r>
+        <w:rPr>
+          <w:rFonts w:ascii="Arial" w:eastAsia="Arial" w:hAnsi="Arial" w:cs="Arial"/>
+          <w:lang w:eastAsia="pt-BR"/>
+        </w:rPr>
+        <w:t>es_auditoria</w:t>
+      </w:r>
+      <w:proofErr w:type="spellEnd"/>
+      <w:r>
+        <w:rPr>
+          <w:rFonts w:ascii="Arial" w:eastAsia="Arial" w:hAnsi="Arial" w:cs="Arial"/>
+          <w:lang w:eastAsia="pt-BR"/>
+        </w:rPr>
+        <w:t>}}</w:t>
       </w:r>
     </w:p>
     <w:p>
@@ -4195,7 +4396,23 @@
           <w:rFonts w:ascii="Arial" w:eastAsia="Arial" w:hAnsi="Arial" w:cs="Arial"/>
           <w:lang w:eastAsia="pt-BR"/>
         </w:rPr>
-        <w:t>{{procedimentos_auditoria}}</w:t>
+        <w:t>{{</w:t>
+      </w:r>
+      <w:proofErr w:type="spellStart"/>
+      <w:r>
+        <w:rPr>
+          <w:rFonts w:ascii="Arial" w:eastAsia="Arial" w:hAnsi="Arial" w:cs="Arial"/>
+          <w:lang w:eastAsia="pt-BR"/>
+        </w:rPr>
+        <w:t>procedimentos_auditoria</w:t>
+      </w:r>
+      <w:proofErr w:type="spellEnd"/>
+      <w:r>
+        <w:rPr>
+          <w:rFonts w:ascii="Arial" w:eastAsia="Arial" w:hAnsi="Arial" w:cs="Arial"/>
+          <w:lang w:eastAsia="pt-BR"/>
+        </w:rPr>
+        <w:t>}}</w:t>
       </w:r>
     </w:p>
     <w:p>
@@ -5070,7 +5287,23 @@
           <w:rFonts w:ascii="Arial" w:eastAsia="Arial" w:hAnsi="Arial" w:cs="Arial"/>
           <w:color w:val="000000"/>
         </w:rPr>
-        <w:t>{{data_atual}}</w:t>
+        <w:t>{{</w:t>
+      </w:r>
+      <w:proofErr w:type="spellStart"/>
+      <w:r>
+        <w:rPr>
+          <w:rFonts w:ascii="Arial" w:eastAsia="Arial" w:hAnsi="Arial" w:cs="Arial"/>
+          <w:color w:val="000000"/>
+        </w:rPr>
+        <w:t>data_atual</w:t>
+      </w:r>
+      <w:proofErr w:type="spellEnd"/>
+      <w:r>
+        <w:rPr>
+          <w:rFonts w:ascii="Arial" w:eastAsia="Arial" w:hAnsi="Arial" w:cs="Arial"/>
+          <w:color w:val="000000"/>
+        </w:rPr>
+        <w:t>}}</w:t>
       </w:r>
       <w:r>
         <w:rPr>
@@ -5119,7 +5352,23 @@
           <w:rFonts w:ascii="Arial" w:eastAsia="Arial" w:hAnsi="Arial" w:cs="Arial"/>
           <w:color w:val="000000"/>
         </w:rPr>
-        <w:t>&lt;Nome_Secretarária&gt;</w:t>
+        <w:t>&lt;</w:t>
+      </w:r>
+      <w:proofErr w:type="spellStart"/>
+      <w:r>
+        <w:rPr>
+          <w:rFonts w:ascii="Arial" w:eastAsia="Arial" w:hAnsi="Arial" w:cs="Arial"/>
+          <w:color w:val="000000"/>
+        </w:rPr>
+        <w:t>Nome_Secretarária</w:t>
+      </w:r>
+      <w:proofErr w:type="spellEnd"/>
+      <w:r>
+        <w:rPr>
+          <w:rFonts w:ascii="Arial" w:eastAsia="Arial" w:hAnsi="Arial" w:cs="Arial"/>
+          <w:color w:val="000000"/>
+        </w:rPr>
+        <w:t>&gt;</w:t>
       </w:r>
     </w:p>
     <w:p>
@@ -7651,7 +7900,7 @@
                     <pic:cNvPicPr/>
                   </pic:nvPicPr>
                   <pic:blipFill>
-                    <a:blip r:embed="rId17" cstate="print">
+                    <a:blip r:embed="rId14" cstate="print">
                       <a:extLst>
                         <a:ext uri="{28A0092B-C50C-407E-A947-70E740481C1C}">
                           <a14:useLocalDpi xmlns:a14="http://schemas.microsoft.com/office/drawing/2010/main" val="0"/>
@@ -7705,7 +7954,7 @@
                     </pic:cNvPicPr>
                   </pic:nvPicPr>
                   <pic:blipFill>
-                    <a:blip r:embed="rId18" cstate="print">
+                    <a:blip r:embed="rId15" cstate="print">
                       <a:extLst>
                         <a:ext uri="{28A0092B-C50C-407E-A947-70E740481C1C}">
                           <a14:useLocalDpi xmlns:a14="http://schemas.microsoft.com/office/drawing/2010/main" val="0"/>
@@ -7745,8 +7994,8 @@
       </w:pPr>
     </w:p>
     <w:sectPr>
-      <w:headerReference w:type="default" r:id="rId19"/>
-      <w:footerReference w:type="default" r:id="rId20"/>
+      <w:headerReference w:type="default" r:id="rId16"/>
+      <w:footerReference w:type="default" r:id="rId17"/>
       <w:pgSz w:w="11906" w:h="16838"/>
       <w:pgMar w:top="851" w:right="1134" w:bottom="1134" w:left="1134" w:header="709" w:footer="709" w:gutter="0"/>
       <w:pgNumType w:start="1"/>
@@ -8161,46 +8410,6 @@
       <w:rPr>
         <w:noProof/>
       </w:rPr>
-      <w:pict w14:anchorId="5D0D9E0D">
-        <v:shapetype id="_x0000_t75" coordsize="21600,21600" o:spt="75" o:preferrelative="t" path="m@4@5l@4@11@9@11@9@5xe" filled="f" stroked="f">
-          <v:stroke joinstyle="miter"/>
-          <v:formulas>
-            <v:f eqn="if lineDrawn pixelLineWidth 0"/>
-            <v:f eqn="sum @0 1 0"/>
-            <v:f eqn="sum 0 0 @1"/>
-            <v:f eqn="prod @2 1 2"/>
-            <v:f eqn="prod @3 21600 pixelWidth"/>
-            <v:f eqn="prod @3 21600 pixelHeight"/>
-            <v:f eqn="sum @0 0 1"/>
-            <v:f eqn="prod @6 1 2"/>
-            <v:f eqn="prod @7 21600 pixelWidth"/>
-            <v:f eqn="sum @8 21600 0"/>
-            <v:f eqn="prod @7 21600 pixelHeight"/>
-            <v:f eqn="sum @10 21600 0"/>
-          </v:formulas>
-          <v:path o:extrusionok="f" gradientshapeok="t" o:connecttype="rect"/>
-          <o:lock v:ext="edit" aspectratio="t"/>
-        </v:shapetype>
-        <v:shape id="WordPictureWatermark100239830" o:spid="_x0000_s1027" type="#_x0000_t75" style="position:absolute;left:0;text-align:left;margin-left:0;margin-top:0;width:523.25pt;height:523.25pt;z-index:-251658238;mso-position-horizontal:center;mso-position-horizontal-relative:margin;mso-position-vertical:center;mso-position-vertical-relative:margin" o:allowincell="f">
-          <v:imagedata r:id="rId1" o:title="marca-dagua"/>
-          <w10:wrap anchorx="margin" anchory="margin"/>
-        </v:shape>
-      </w:pict>
-    </w:r>
-  </w:p>
-</w:hdr>
-</file>
-
-<file path=word/header3.xml><?xml version="1.0" encoding="utf-8"?>
-<w:hdr xmlns:wpc="http://schemas.microsoft.com/office/word/2010/wordprocessingCanvas" xmlns:cx="http://schemas.microsoft.com/office/drawing/2014/chartex" xmlns:cx1="http://schemas.microsoft.com/office/drawing/2015/9/8/chartex" xmlns:cx2="http://schemas.microsoft.com/office/drawing/2015/10/21/chartex" xmlns:cx3="http://schemas.microsoft.com/office/drawing/2016/5/9/chartex" xmlns:cx4="http://schemas.microsoft.com/office/drawing/2016/5/10/chartex" xmlns:cx5="http://schemas.microsoft.com/office/drawing/2016/5/11/chartex" xmlns:cx6="http://schemas.microsoft.com/office/drawing/2016/5/12/chartex" xmlns:cx7="http://schemas.microsoft.com/office/drawing/2016/5/13/chartex" xmlns:cx8="http://schemas.microsoft.com/office/drawing/2016/5/14/chartex" xmlns:mc="http://schemas.openxmlformats.org/markup-compatibility/2006" xmlns:aink="http://schemas.microsoft.com/office/drawing/2016/ink" xmlns:am3d="http://schemas.microsoft.com/office/drawing/2017/model3d" xmlns:o="urn:schemas-microsoft-com:office:office" xmlns:oel="http://schemas.microsoft.com/office/2019/extlst" xmlns:r="http://schemas.openxmlformats.org/officeDocument/2006/relationships" xmlns:m="http://schemas.openxmlformats.org/officeDocument/2006/math" xmlns:v="urn:schemas-microsoft-com:vml" xmlns:wp14="http://schemas.microsoft.com/office/word/2010/wordprocessingDrawing" xmlns:wp="http://schemas.openxmlformats.org/drawingml/2006/wordprocessingDrawing" xmlns:w10="urn:schemas-microsoft-com:office:word" xmlns:w="http://schemas.openxmlformats.org/wordprocessingml/2006/main" xmlns:w14="http://schemas.microsoft.com/office/word/2010/wordml" xmlns:w15="http://schemas.microsoft.com/office/word/2012/wordml" xmlns:w16cex="http://schemas.microsoft.com/office/word/2018/wordml/cex" xmlns:w16cid="http://schemas.microsoft.com/office/word/2016/wordml/cid" xmlns:w16="http://schemas.microsoft.com/office/word/2018/wordml" xmlns:w16du="http://schemas.microsoft.com/office/word/2023/wordml/word16du" xmlns:w16sdtdh="http://schemas.microsoft.com/office/word/2020/wordml/sdtdatahash" xmlns:w16sdtfl="http://schemas.microsoft.com/office/word/2024/wordml/sdtformatlock" xmlns:w16se="http://schemas.microsoft.com/office/word/2015/wordml/symex" xmlns:wpg="http://schemas.microsoft.com/office/word/2010/wordprocessingGroup" xmlns:wpi="http://schemas.microsoft.com/office/word/2010/wordprocessingInk" xmlns:wne="http://schemas.microsoft.com/office/word/2006/wordml" xmlns:wps="http://schemas.microsoft.com/office/word/2010/wordprocessingShape" mc:Ignorable="w14 w15 w16se w16cid w16 w16cex w16sdtdh w16sdtfl w16du wp14">
-  <w:p>
-    <w:pPr>
-      <w:pStyle w:val="Cabealho"/>
-    </w:pPr>
-    <w:r>
-      <w:rPr>
-        <w:noProof/>
-      </w:rPr>
       <w:pict w14:anchorId="4B6B8D46">
         <v:shapetype id="_x0000_t75" coordsize="21600,21600" o:spt="75" o:preferrelative="t" path="m@4@5l@4@11@9@11@9@5xe" filled="f" stroked="f">
           <v:stroke joinstyle="miter"/>
@@ -8231,7 +8440,7 @@
 </w:hdr>
 </file>
 
-<file path=word/header4.xml><?xml version="1.0" encoding="utf-8"?>
+<file path=word/header3.xml><?xml version="1.0" encoding="utf-8"?>
 <w:hdr xmlns:wpc="http://schemas.microsoft.com/office/word/2010/wordprocessingCanvas" xmlns:cx="http://schemas.microsoft.com/office/drawing/2014/chartex" xmlns:cx1="http://schemas.microsoft.com/office/drawing/2015/9/8/chartex" xmlns:cx2="http://schemas.microsoft.com/office/drawing/2015/10/21/chartex" xmlns:cx3="http://schemas.microsoft.com/office/drawing/2016/5/9/chartex" xmlns:cx4="http://schemas.microsoft.com/office/drawing/2016/5/10/chartex" xmlns:cx5="http://schemas.microsoft.com/office/drawing/2016/5/11/chartex" xmlns:cx6="http://schemas.microsoft.com/office/drawing/2016/5/12/chartex" xmlns:cx7="http://schemas.microsoft.com/office/drawing/2016/5/13/chartex" xmlns:cx8="http://schemas.microsoft.com/office/drawing/2016/5/14/chartex" xmlns:mc="http://schemas.openxmlformats.org/markup-compatibility/2006" xmlns:aink="http://schemas.microsoft.com/office/drawing/2016/ink" xmlns:am3d="http://schemas.microsoft.com/office/drawing/2017/model3d" xmlns:o="urn:schemas-microsoft-com:office:office" xmlns:oel="http://schemas.microsoft.com/office/2019/extlst" xmlns:r="http://schemas.openxmlformats.org/officeDocument/2006/relationships" xmlns:m="http://schemas.openxmlformats.org/officeDocument/2006/math" xmlns:v="urn:schemas-microsoft-com:vml" xmlns:wp14="http://schemas.microsoft.com/office/word/2010/wordprocessingDrawing" xmlns:wp="http://schemas.openxmlformats.org/drawingml/2006/wordprocessingDrawing" xmlns:w10="urn:schemas-microsoft-com:office:word" xmlns:w="http://schemas.openxmlformats.org/wordprocessingml/2006/main" xmlns:w14="http://schemas.microsoft.com/office/word/2010/wordml" xmlns:w15="http://schemas.microsoft.com/office/word/2012/wordml" xmlns:w16cex="http://schemas.microsoft.com/office/word/2018/wordml/cex" xmlns:w16cid="http://schemas.microsoft.com/office/word/2016/wordml/cid" xmlns:w16="http://schemas.microsoft.com/office/word/2018/wordml" xmlns:w16du="http://schemas.microsoft.com/office/word/2023/wordml/word16du" xmlns:w16sdtdh="http://schemas.microsoft.com/office/word/2020/wordml/sdtdatahash" xmlns:w16sdtfl="http://schemas.microsoft.com/office/word/2024/wordml/sdtformatlock" xmlns:w16se="http://schemas.microsoft.com/office/word/2015/wordml/symex" xmlns:wpg="http://schemas.microsoft.com/office/word/2010/wordprocessingGroup" xmlns:wpi="http://schemas.microsoft.com/office/word/2010/wordprocessingInk" xmlns:wne="http://schemas.microsoft.com/office/word/2006/wordml" xmlns:wps="http://schemas.microsoft.com/office/word/2010/wordprocessingShape" mc:Ignorable="w14 w15 w16se w16cid w16 w16cex w16sdtdh w16sdtfl w16du wp14">
   <w:p>
     <w:pPr>
@@ -13906,10 +14115,30 @@
 </file>
 
 <file path=customXml/item1.xml><?xml version="1.0" encoding="utf-8"?>
+<p:properties xmlns:p="http://schemas.microsoft.com/office/2006/metadata/properties" xmlns:xsi="http://www.w3.org/2001/XMLSchema-instance" xmlns:pc="http://schemas.microsoft.com/office/infopath/2007/PartnerControls">
+  <documentManagement>
+    <lcf76f155ced4ddcb4097134ff3c332f xmlns="cafa2f08-7da3-4c0e-9ece-55bccef3ffa7">
+      <Terms xmlns="http://schemas.microsoft.com/office/infopath/2007/PartnerControls"/>
+    </lcf76f155ced4ddcb4097134ff3c332f>
+    <TaxCatchAll xmlns="f8e977c5-1382-4d06-a69c-9787a52d7675" xsi:nil="true"/>
+  </documentManagement>
+</p:properties>
+</file>
+
+<file path=customXml/item2.xml><?xml version="1.0" encoding="utf-8"?>
+<?mso-contentType ?>
+<FormTemplates xmlns="http://schemas.microsoft.com/sharepoint/v3/contenttype/forms">
+  <Display>DocumentLibraryForm</Display>
+  <Edit>DocumentLibraryForm</Edit>
+  <New>DocumentLibraryForm</New>
+</FormTemplates>
+</file>
+
+<file path=customXml/item3.xml><?xml version="1.0" encoding="utf-8"?>
 <b:Sources xmlns:b="http://schemas.openxmlformats.org/officeDocument/2006/bibliography" xmlns="http://schemas.openxmlformats.org/officeDocument/2006/bibliography" SelectedStyle="\APASixthEditionOfficeOnline.xsl" StyleName="APA" Version="6"/>
 </file>
 
-<file path=customXml/item2.xml><?xml version="1.0" encoding="utf-8"?>
+<file path=customXml/item4.xml><?xml version="1.0" encoding="utf-8"?>
 <ct:contentTypeSchema xmlns:ct="http://schemas.microsoft.com/office/2006/metadata/contentType" xmlns:ma="http://schemas.microsoft.com/office/2006/metadata/properties/metaAttributes" ct:_="" ma:_="" ma:contentTypeName="Documento" ma:contentTypeID="0x010100C1BE48FA3000F34A913629A2C4BE2A6B" ma:contentTypeVersion="15" ma:contentTypeDescription="Crie um novo documento." ma:contentTypeScope="" ma:versionID="05e941f3ad81596ec6b8e2c7da1d006a">
   <xsd:schema xmlns:xsd="http://www.w3.org/2001/XMLSchema" xmlns:xs="http://www.w3.org/2001/XMLSchema" xmlns:p="http://schemas.microsoft.com/office/2006/metadata/properties" xmlns:ns2="cafa2f08-7da3-4c0e-9ece-55bccef3ffa7" xmlns:ns3="f8e977c5-1382-4d06-a69c-9787a52d7675" targetNamespace="http://schemas.microsoft.com/office/2006/metadata/properties" ma:root="true" ma:fieldsID="27eb6bda365d175acb89cc5e0f5778f3" ns2:_="" ns3:_="">
     <xsd:import namespace="cafa2f08-7da3-4c0e-9ece-55bccef3ffa7"/>
@@ -14144,27 +14373,26 @@
 </ct:contentTypeSchema>
 </file>
 
-<file path=customXml/item3.xml><?xml version="1.0" encoding="utf-8"?>
-<p:properties xmlns:p="http://schemas.microsoft.com/office/2006/metadata/properties" xmlns:xsi="http://www.w3.org/2001/XMLSchema-instance" xmlns:pc="http://schemas.microsoft.com/office/infopath/2007/PartnerControls">
-  <documentManagement>
-    <lcf76f155ced4ddcb4097134ff3c332f xmlns="cafa2f08-7da3-4c0e-9ece-55bccef3ffa7">
-      <Terms xmlns="http://schemas.microsoft.com/office/infopath/2007/PartnerControls"/>
-    </lcf76f155ced4ddcb4097134ff3c332f>
-    <TaxCatchAll xmlns="f8e977c5-1382-4d06-a69c-9787a52d7675" xsi:nil="true"/>
-  </documentManagement>
-</p:properties>
+<file path=customXml/itemProps1.xml><?xml version="1.0" encoding="utf-8"?>
+<ds:datastoreItem xmlns:ds="http://schemas.openxmlformats.org/officeDocument/2006/customXml" ds:itemID="{B8D8A775-93AF-4C7C-B6D7-D024C9468640}">
+  <ds:schemaRefs>
+    <ds:schemaRef ds:uri="http://schemas.microsoft.com/office/2006/metadata/properties"/>
+    <ds:schemaRef ds:uri="http://schemas.microsoft.com/office/infopath/2007/PartnerControls"/>
+    <ds:schemaRef ds:uri="cafa2f08-7da3-4c0e-9ece-55bccef3ffa7"/>
+    <ds:schemaRef ds:uri="f8e977c5-1382-4d06-a69c-9787a52d7675"/>
+  </ds:schemaRefs>
+</ds:datastoreItem>
 </file>
 
-<file path=customXml/item4.xml><?xml version="1.0" encoding="utf-8"?>
-<?mso-contentType ?>
-<FormTemplates xmlns="http://schemas.microsoft.com/sharepoint/v3/contenttype/forms">
-  <Display>DocumentLibraryForm</Display>
-  <Edit>DocumentLibraryForm</Edit>
-  <New>DocumentLibraryForm</New>
-</FormTemplates>
+<file path=customXml/itemProps2.xml><?xml version="1.0" encoding="utf-8"?>
+<ds:datastoreItem xmlns:ds="http://schemas.openxmlformats.org/officeDocument/2006/customXml" ds:itemID="{0E53808B-D90D-4888-8F7B-330548B356EA}">
+  <ds:schemaRefs>
+    <ds:schemaRef ds:uri="http://schemas.microsoft.com/sharepoint/v3/contenttype/forms"/>
+  </ds:schemaRefs>
+</ds:datastoreItem>
 </file>
 
-<file path=customXml/itemProps1.xml><?xml version="1.0" encoding="utf-8"?>
+<file path=customXml/itemProps3.xml><?xml version="1.0" encoding="utf-8"?>
 <ds:datastoreItem xmlns:ds="http://schemas.openxmlformats.org/officeDocument/2006/customXml" ds:itemID="{D0BD369B-7970-45CB-B3A7-BC5AB268C4DD}">
   <ds:schemaRefs>
     <ds:schemaRef ds:uri="http://schemas.openxmlformats.org/officeDocument/2006/bibliography"/>
@@ -14172,7 +14400,7 @@
 </ds:datastoreItem>
 </file>
 
-<file path=customXml/itemProps2.xml><?xml version="1.0" encoding="utf-8"?>
+<file path=customXml/itemProps4.xml><?xml version="1.0" encoding="utf-8"?>
 <ds:datastoreItem xmlns:ds="http://schemas.openxmlformats.org/officeDocument/2006/customXml" ds:itemID="{599A9B5B-C617-483D-BF53-9D60AAC3B4C7}">
   <ds:schemaRefs>
     <ds:schemaRef ds:uri="http://schemas.microsoft.com/office/2006/metadata/contentType"/>
@@ -14189,23 +14417,4 @@
     <ds:schemaRef ds:uri="http://schemas.microsoft.com/internal/obd"/>
   </ds:schemaRefs>
 </ds:datastoreItem>
-</file>
-
-<file path=customXml/itemProps3.xml><?xml version="1.0" encoding="utf-8"?>
-<ds:datastoreItem xmlns:ds="http://schemas.openxmlformats.org/officeDocument/2006/customXml" ds:itemID="{B8D8A775-93AF-4C7C-B6D7-D024C9468640}">
-  <ds:schemaRefs>
-    <ds:schemaRef ds:uri="http://schemas.microsoft.com/office/2006/metadata/properties"/>
-    <ds:schemaRef ds:uri="http://schemas.microsoft.com/office/infopath/2007/PartnerControls"/>
-    <ds:schemaRef ds:uri="cafa2f08-7da3-4c0e-9ece-55bccef3ffa7"/>
-    <ds:schemaRef ds:uri="f8e977c5-1382-4d06-a69c-9787a52d7675"/>
-  </ds:schemaRefs>
-</ds:datastoreItem>
-</file>
-
-<file path=customXml/itemProps4.xml><?xml version="1.0" encoding="utf-8"?>
-<ds:datastoreItem xmlns:ds="http://schemas.openxmlformats.org/officeDocument/2006/customXml" ds:itemID="{0E53808B-D90D-4888-8F7B-330548B356EA}">
-  <ds:schemaRefs>
-    <ds:schemaRef ds:uri="http://schemas.microsoft.com/sharepoint/v3/contenttype/forms"/>
-  </ds:schemaRefs>
-</ds:datastoreItem>
 </file>
</xml_diff>